<commit_message>
Speech completo con la segunda parte en lenguaje sencillo
Co-Authored-By: Claude Sonnet 5.5 <noreply@anthropic.com>
</commit_message>
<xml_diff>
--- a/docs/Speech_completo.docx
+++ b/docs/Speech_completo.docx
@@ -2,39 +2,6 @@
 <file path=word/document.xml><?xml version="1.0" encoding="utf-8"?>
 <w:document xmlns:wpc="http://schemas.microsoft.com/office/word/2010/wordprocessingCanvas" xmlns:cx="http://schemas.microsoft.com/office/drawing/2014/chartex" xmlns:cx1="http://schemas.microsoft.com/office/drawing/2015/9/8/chartex" xmlns:cx2="http://schemas.microsoft.com/office/drawing/2015/10/21/chartex" xmlns:cx3="http://schemas.microsoft.com/office/drawing/2016/5/9/chartex" xmlns:cx4="http://schemas.microsoft.com/office/drawing/2016/5/10/chartex" xmlns:cx5="http://schemas.microsoft.com/office/drawing/2016/5/11/chartex" xmlns:cx6="http://schemas.microsoft.com/office/drawing/2016/5/12/chartex" xmlns:cx7="http://schemas.microsoft.com/office/drawing/2016/5/13/chartex" xmlns:cx8="http://schemas.microsoft.com/office/drawing/2016/5/14/chartex" xmlns:mc="http://schemas.openxmlformats.org/markup-compatibility/2006" xmlns:aink="http://schemas.microsoft.com/office/drawing/2016/ink" xmlns:am3d="http://schemas.microsoft.com/office/drawing/2017/model3d" xmlns:o="urn:schemas-microsoft-com:office:office" xmlns:oel="http://schemas.microsoft.com/office/2019/extlst" xmlns:r="http://schemas.openxmlformats.org/officeDocument/2006/relationships" xmlns:m="http://schemas.openxmlformats.org/officeDocument/2006/math" xmlns:v="urn:schemas-microsoft-com:vml" xmlns:wp14="http://schemas.microsoft.com/office/word/2010/wordprocessingDrawing" xmlns:wp="http://schemas.openxmlformats.org/drawingml/2006/wordprocessingDrawing" xmlns:w10="urn:schemas-microsoft-com:office:word" xmlns:w="http://schemas.openxmlformats.org/wordprocessingml/2006/main" xmlns:w14="http://schemas.microsoft.com/office/word/2010/wordml" xmlns:w15="http://schemas.microsoft.com/office/word/2012/wordml" xmlns:w16cex="http://schemas.microsoft.com/office/word/2018/wordml/cex" xmlns:w16cid="http://schemas.microsoft.com/office/word/2016/wordml/cid" xmlns:w16="http://schemas.microsoft.com/office/word/2018/wordml" xmlns:w16du="http://schemas.microsoft.com/office/word/2023/wordml/word16du" xmlns:w16sdtdh="http://schemas.microsoft.com/office/word/2020/wordml/sdtdatahash" xmlns:w16sdtfl="http://schemas.microsoft.com/office/word/2024/wordml/sdtformatlock" xmlns:w16se="http://schemas.microsoft.com/office/word/2015/wordml/symex" xmlns:wpg="http://schemas.microsoft.com/office/word/2010/wordprocessingGroup" xmlns:wpi="http://schemas.microsoft.com/office/word/2010/wordprocessingInk" xmlns:wne="http://schemas.microsoft.com/office/word/2006/wordml" xmlns:wps="http://schemas.microsoft.com/office/word/2010/wordprocessingShape" mc:Ignorable="w14 w15 w16se w16cid w16 w16cex w16sdtdh w16sdtfl w16du wp14">
   <w:body>
-    <w:p>
-      <w:r>
-        <w:t>LA HISTORIA (0:00 – 4:30)</w:t>
-      </w:r>
-    </w:p>
-    <w:p>
-      <w:pPr>
-        <w:rPr>
-          <w:b/>
-          <w:bCs/>
-        </w:rPr>
-      </w:pPr>
-      <w:r>
-        <w:rPr>
-          <w:b/>
-          <w:bCs/>
-        </w:rPr>
-        <w:t xml:space="preserve">0:00 – 0:15 · Bienvenida (Laura, con la portada en pantalla)</w:t>
-      </w:r>
-    </w:p>
-    <w:p>
-      <w:r>
-        <w:rPr>
-          <w:b/>
-          <w:bCs/>
-        </w:rPr>
-        <w:t xml:space="preserve">Laura:</w:t>
-      </w:r>
-      <w:r>
-        <w:t xml:space="preserve"> "Bienvenidos a Cuna y Canas. Buenos días. Cuna y Canas cuenta qué hace falta y qué viene en tu barrio, desde la cuna hasta las canas, con los datos abiertos de la Comunidad de Madrid. Y como los datos se entienden mejor con una persona detrás, os lo cuento con una historia: la mía."</w:t>
-      </w:r>
-    </w:p>
-    <w:p/>
     <w:p>
       <w:pPr>
         <w:rPr>
@@ -1379,7 +1346,7 @@
           <w:i/>
           <w:iCs/>
         </w:rPr>
-        <w:t xml:space="preserve">Aquí se acaba el rol play: Laura y Carmen salen del personaje y hablan ellas. Diapositivas del PDF "Final MAD Open Data Challenge 2026" (0 a 6; la portada ya estaba puesta al empezar).</w:t>
+        <w:t xml:space="preserve">Aquí se acaba el rol play: Laura y Carmen salen del personaje y hablan ellas. Lenguaje sencillo, frases cortas, como si se lo explicáramos a un niño. Diapositivas del PDF "Final MAD Open Data Challenge 2026" (la portada ya estaba puesta al empezar).</w:t>
       </w:r>
     </w:p>
     <w:p/>
@@ -1472,7 +1439,7 @@
         <w:t xml:space="preserve">Claudia Agromayor</w:t>
       </w:r>
       <w:r>
-        <w:t xml:space="preserve">. Y venimos a contaros qué hay detrás de lo que acabáis de ver: un problema de toda la Comunidad de Madrid, los datos abiertos con los que lo resolvemos, y por qué podéis fiaros de ellos.</w:t>
+        <w:t xml:space="preserve">. Y vamos a contaros, con palabras sencillas, cómo funciona por dentro lo que acabáis de ver.</w:t>
       </w:r>
       <w:r>
         <w:t xml:space="preserve">"</w:t>
@@ -1491,7 +1458,7 @@
           <w:b/>
           <w:bCs/>
         </w:rPr>
-        <w:t xml:space="preserve">5:20 – 6:00 · El problema es de toda la Comunidad (diapositiva 1 · Lucía)</w:t>
+        <w:t xml:space="preserve">5:20 – 6:00 · El problema (diapositiva 1 · Lucía)</w:t>
       </w:r>
     </w:p>
     <w:p>
@@ -1506,27 +1473,45 @@
         <w:t xml:space="preserve"> "</w:t>
       </w:r>
       <w:r>
-        <w:t xml:space="preserve">Lo de Getafe no es un caso aislado. El planeamiento prevé más de </w:t>
-      </w:r>
-      <w:r>
-        <w:rPr>
-          <w:b/>
-          <w:bCs/>
-        </w:rPr>
-        <w:t xml:space="preserve">513.000 viviendas en 144 municipios</w:t>
-      </w:r>
-      <w:r>
-        <w:t xml:space="preserve">. Según el catastro, unas </w:t>
-      </w:r>
-      <w:r>
-        <w:rPr>
-          <w:b/>
-          <w:bCs/>
-        </w:rPr>
-        <w:t xml:space="preserve">222.000 aún no están construidas</w:t>
-      </w:r>
-      <w:r>
-        <w:t xml:space="preserve">: esas son las que vienen. Con ellas, entre </w:t>
+        <w:t xml:space="preserve">Imaginad que un barrio nuevo es una clase que se va llenando de niños. Hacen falta sillas, una profesora y un patio. Pues en Madrid se van a construir muchísimas casas. El plan prevé más de </w:t>
+      </w:r>
+      <w:r>
+        <w:rPr>
+          <w:b/>
+          <w:bCs/>
+        </w:rPr>
+        <w:t xml:space="preserve">513.000</w:t>
+      </w:r>
+      <w:r>
+        <w:t xml:space="preserve">, y según el catastro, que es el registro de las casas, </w:t>
+      </w:r>
+      <w:r>
+        <w:rPr>
+          <w:b/>
+          <w:bCs/>
+        </w:rPr>
+        <w:t xml:space="preserve">unas 222.000 todavía no están hechas</w:t>
+      </w:r>
+      <w:r>
+        <w:t xml:space="preserve">.</w:t>
+      </w:r>
+      <w:r>
+        <w:t xml:space="preserve">"</w:t>
+      </w:r>
+    </w:p>
+    <w:p>
+      <w:r>
+        <w:rPr>
+          <w:b/>
+          <w:bCs/>
+        </w:rPr>
+        <w:t xml:space="preserve">Lucía:</w:t>
+      </w:r>
+      <w:r>
+        <w:t xml:space="preserve"> "</w:t>
+      </w:r>
+      <w:r>
+        <w:t xml:space="preserve">En esas casas vivirán entre </w:t>
       </w:r>
       <w:r>
         <w:rPr>
@@ -1536,7 +1521,7 @@
         <w:t xml:space="preserve">medio millón y 700.000 personas</w:t>
       </w:r>
       <w:r>
-        <w:t xml:space="preserve">, y harían falta entre </w:t>
+        <w:t xml:space="preserve">. Necesitarán entre </w:t>
       </w:r>
       <w:r>
         <w:rPr>
@@ -1546,14 +1531,14 @@
         <w:t xml:space="preserve">38.000 y 93.000 plazas de colegio</w:t>
       </w:r>
       <w:r>
-        <w:t xml:space="preserve"> y el equivalente a </w:t>
-      </w:r>
-      <w:r>
-        <w:rPr>
-          <w:b/>
-          <w:bCs/>
-        </w:rPr>
-        <w:t xml:space="preserve">19–27 centros de salud</w:t>
+        <w:t xml:space="preserve"> y unos </w:t>
+      </w:r>
+      <w:r>
+        <w:rPr>
+          <w:b/>
+          <w:bCs/>
+        </w:rPr>
+        <w:t xml:space="preserve">19 a 27 centros de salud</w:t>
       </w:r>
       <w:r>
         <w:t xml:space="preserve">.</w:t>
@@ -1574,7 +1559,7 @@
         <w:t xml:space="preserve"> "</w:t>
       </w:r>
       <w:r>
-        <w:t xml:space="preserve">Y ya pasa: en </w:t>
+        <w:t xml:space="preserve">¿Y el problema? Que primero llegan las casas, y los colegios llegan tarde. En </w:t>
       </w:r>
       <w:r>
         <w:rPr>
@@ -1584,17 +1569,47 @@
         <w:t xml:space="preserve">Los Molinos</w:t>
       </w:r>
       <w:r>
-        <w:t xml:space="preserve">, el </w:t>
-      </w:r>
-      <w:r>
-        <w:rPr>
-          <w:b/>
-          <w:bCs/>
-        </w:rPr>
-        <w:t xml:space="preserve">72 % del suelo reservado para equipamientos sigue vacío</w:t>
-      </w:r>
-      <w:r>
-        <w:t xml:space="preserve"> mientras viven 11.473 personas sin centro de salud cerca. Hay suelo; falta decidir dónde y cuándo.</w:t>
+        <w:t xml:space="preserve"> viven 11.473 personas, y el </w:t>
+      </w:r>
+      <w:r>
+        <w:rPr>
+          <w:b/>
+          <w:bCs/>
+        </w:rPr>
+        <w:t xml:space="preserve">72 %</w:t>
+      </w:r>
+      <w:r>
+        <w:t xml:space="preserve"> del suelo que se guardó para colegios y centros de salud sigue </w:t>
+      </w:r>
+      <w:r>
+        <w:rPr>
+          <w:b/>
+          <w:bCs/>
+        </w:rPr>
+        <w:t xml:space="preserve">vacío</w:t>
+      </w:r>
+      <w:r>
+        <w:t xml:space="preserve">. Hay sitio. Lo que falta es decidir </w:t>
+      </w:r>
+      <w:r>
+        <w:rPr>
+          <w:b/>
+          <w:bCs/>
+        </w:rPr>
+        <w:t xml:space="preserve">dónde</w:t>
+      </w:r>
+      <w:r>
+        <w:t xml:space="preserve"> y </w:t>
+      </w:r>
+      <w:r>
+        <w:rPr>
+          <w:b/>
+          <w:bCs/>
+        </w:rPr>
+        <w:t xml:space="preserve">cuándo</w:t>
+      </w:r>
+      <w:r>
+        <w:t xml:space="preserve">.</w:t>
       </w:r>
       <w:r>
         <w:t xml:space="preserve">"</w:t>
@@ -1648,17 +1663,35 @@
         <w:t xml:space="preserve"> "</w:t>
       </w:r>
       <w:r>
-        <w:t xml:space="preserve">Las herramientas actuales te dicen dónde vivir hoy. </w:t>
-      </w:r>
-      <w:r>
-        <w:rPr>
-          <w:b/>
-          <w:bCs/>
-        </w:rPr>
-        <w:t xml:space="preserve">Cuna y Canas te dice qué va a faltar mañana, y dónde ponerlo.</w:t>
-      </w:r>
-      <w:r>
-        <w:t xml:space="preserve"> Son tres pantallas con los mismos datos: </w:t>
+        <w:t xml:space="preserve">Cuna y Canas es una web con </w:t>
+      </w:r>
+      <w:r>
+        <w:rPr>
+          <w:b/>
+          <w:bCs/>
+        </w:rPr>
+        <w:t xml:space="preserve">tres pantallas</w:t>
+      </w:r>
+      <w:r>
+        <w:t xml:space="preserve"> que usan los mismos datos.</w:t>
+      </w:r>
+      <w:r>
+        <w:t xml:space="preserve">"</w:t>
+      </w:r>
+    </w:p>
+    <w:p>
+      <w:r>
+        <w:rPr>
+          <w:b/>
+          <w:bCs/>
+        </w:rPr>
+        <w:t xml:space="preserve">Claudia:</w:t>
+      </w:r>
+      <w:r>
+        <w:t xml:space="preserve"> "</w:t>
+      </w:r>
+      <w:r>
+        <w:t xml:space="preserve">La primera, </w:t>
       </w:r>
       <w:r>
         <w:rPr>
@@ -1668,7 +1701,7 @@
         <w:t xml:space="preserve">¿Dónde vivir?</w:t>
       </w:r>
       <w:r>
-        <w:t xml:space="preserve"> ordena los 179 municipios según tu vida; </w:t>
+        <w:t xml:space="preserve">, es para una familia: dices qué necesitas y te ordena los 179 municipios. La segunda, </w:t>
       </w:r>
       <w:r>
         <w:rPr>
@@ -1678,7 +1711,7 @@
         <w:t xml:space="preserve">Barrios</w:t>
       </w:r>
       <w:r>
-        <w:t xml:space="preserve"> enseña qué tienes a 5, 10 o 20 minutos andando y qué viene; y </w:t>
+        <w:t xml:space="preserve">, te enseña qué tienes cerca andando, a 5, 10 o 20 minutos. Y la tercera, </w:t>
       </w:r>
       <w:r>
         <w:rPr>
@@ -1688,7 +1721,45 @@
         <w:t xml:space="preserve">Planificar</w:t>
       </w:r>
       <w:r>
-        <w:t xml:space="preserve">, la que usaba Carmen, dice cuántos centros, cuándo y dónde.</w:t>
+        <w:t xml:space="preserve">, es para quien decide, como Carmen: cuántos colegios hacen falta, cuándo y dónde.</w:t>
+      </w:r>
+      <w:r>
+        <w:t xml:space="preserve">"</w:t>
+      </w:r>
+    </w:p>
+    <w:p>
+      <w:r>
+        <w:rPr>
+          <w:b/>
+          <w:bCs/>
+        </w:rPr>
+        <w:t xml:space="preserve">Claudia:</w:t>
+      </w:r>
+      <w:r>
+        <w:t xml:space="preserve"> "</w:t>
+      </w:r>
+      <w:r>
+        <w:t xml:space="preserve">Los demás te dicen dónde vivir </w:t>
+      </w:r>
+      <w:r>
+        <w:rPr>
+          <w:b/>
+          <w:bCs/>
+        </w:rPr>
+        <w:t xml:space="preserve">hoy</w:t>
+      </w:r>
+      <w:r>
+        <w:t xml:space="preserve">. Nosotras te decimos qué va a faltar </w:t>
+      </w:r>
+      <w:r>
+        <w:rPr>
+          <w:b/>
+          <w:bCs/>
+        </w:rPr>
+        <w:t xml:space="preserve">mañana</w:t>
+      </w:r>
+      <w:r>
+        <w:t xml:space="preserve">, y dónde ponerlo.</w:t>
       </w:r>
       <w:r>
         <w:t xml:space="preserve">"</w:t>
@@ -1742,27 +1813,17 @@
         <w:t xml:space="preserve"> "</w:t>
       </w:r>
       <w:r>
-        <w:t xml:space="preserve">Todo sale de </w:t>
-      </w:r>
-      <w:r>
-        <w:rPr>
-          <w:b/>
-          <w:bCs/>
-        </w:rPr>
-        <w:t xml:space="preserve">datos abiertos consultados por API</w:t>
-      </w:r>
-      <w:r>
-        <w:t xml:space="preserve">: el portal y el IDEM de la Comunidad de Madrid, el Atlas de Renta del INE y el Consorcio de Transportes. La tabla dice también </w:t>
-      </w:r>
-      <w:r>
-        <w:rPr>
-          <w:b/>
-          <w:bCs/>
-        </w:rPr>
-        <w:t xml:space="preserve">para qué no se usa cada fuente</w:t>
-      </w:r>
-      <w:r>
-        <w:t xml:space="preserve">: sin licitaciones, sin saber quién es el dueño de cada parcela, sin tiempos de viaje reales. Preferimos decirlo a inventarlo.</w:t>
+        <w:t xml:space="preserve">Todo viene de </w:t>
+      </w:r>
+      <w:r>
+        <w:rPr>
+          <w:b/>
+          <w:bCs/>
+        </w:rPr>
+        <w:t xml:space="preserve">datos abiertos</w:t>
+      </w:r>
+      <w:r>
+        <w:t xml:space="preserve">: información que las administraciones publican para que cualquiera la use. La cogemos de la Comunidad de Madrid, del INE, que es quien cuenta a la población, y del Consorcio de Transportes, el del metro y los autobuses. Un ordenador la lee solo, por internet.</w:t>
       </w:r>
       <w:r>
         <w:t xml:space="preserve">"</w:t>
@@ -1780,27 +1841,45 @@
         <w:t xml:space="preserve"> "</w:t>
       </w:r>
       <w:r>
-        <w:t xml:space="preserve">Cobertura: </w:t>
-      </w:r>
-      <w:r>
-        <w:rPr>
-          <w:b/>
-          <w:bCs/>
-        </w:rPr>
-        <w:t xml:space="preserve">179 municipios</w:t>
-      </w:r>
-      <w:r>
-        <w:t xml:space="preserve"> en el ranking y 144 con viviendas previstas. Y al cruzar fuentes encontramos </w:t>
-      </w:r>
-      <w:r>
-        <w:rPr>
-          <w:b/>
-          <w:bCs/>
-        </w:rPr>
-        <w:t xml:space="preserve">errores en datos oficiales</w:t>
-      </w:r>
-      <w:r>
-        <w:t xml:space="preserve">: centros de salud puestos en otra ciudad con una calle del mismo nombre, o paradas de Ciudad Real con el código de un pueblo de Madrid. Los hemos corregido y se los podemos devolver a la Comunidad.</w:t>
+        <w:t xml:space="preserve">Y en la tabla ponemos también lo que </w:t>
+      </w:r>
+      <w:r>
+        <w:rPr>
+          <w:b/>
+          <w:bCs/>
+        </w:rPr>
+        <w:t xml:space="preserve">no sabemos</w:t>
+      </w:r>
+      <w:r>
+        <w:t xml:space="preserve">: por ejemplo, de quién es cada terreno, o cuánto se tarda en llegar por la calle. Preferimos decirlo antes que inventarlo.</w:t>
+      </w:r>
+      <w:r>
+        <w:t xml:space="preserve">"</w:t>
+      </w:r>
+    </w:p>
+    <w:p>
+      <w:r>
+        <w:rPr>
+          <w:b/>
+          <w:bCs/>
+        </w:rPr>
+        <w:t xml:space="preserve">Lucía:</w:t>
+      </w:r>
+      <w:r>
+        <w:t xml:space="preserve"> "</w:t>
+      </w:r>
+      <w:r>
+        <w:t xml:space="preserve">Además, encontramos </w:t>
+      </w:r>
+      <w:r>
+        <w:rPr>
+          <w:b/>
+          <w:bCs/>
+        </w:rPr>
+        <w:t xml:space="preserve">fallos en los datos oficiales</w:t>
+      </w:r>
+      <w:r>
+        <w:t xml:space="preserve">: centros de salud puestos en otra ciudad, o paradas de Ciudad Real con el código de un pueblo de Madrid. Los hemos arreglado, y podemos devolvérselos a la Comunidad.</w:t>
       </w:r>
       <w:r>
         <w:t xml:space="preserve">"</w:t>
@@ -1839,7 +1918,7 @@
           <w:b/>
           <w:bCs/>
         </w:rPr>
-        <w:t xml:space="preserve">7:25 – 8:40 · Cómo se calcula y por qué fiarse (diapositiva 4 · Claudia)</w:t>
+        <w:t xml:space="preserve">7:25 – 8:40 · Cómo lo calculamos (diapositiva 4 · Claudia)</w:t>
       </w:r>
     </w:p>
     <w:p>
@@ -1874,14 +1953,14 @@
         <w:t xml:space="preserve"> "</w:t>
       </w:r>
       <w:r>
-        <w:t xml:space="preserve">Del dato abierto a la parcela propuesta, en siete pasos. Pero lo importante son </w:t>
-      </w:r>
-      <w:r>
-        <w:rPr>
-          <w:b/>
-          <w:bCs/>
-        </w:rPr>
-        <w:t xml:space="preserve">dos cálculos</w:t>
+        <w:t xml:space="preserve">Hacemos </w:t>
+      </w:r>
+      <w:r>
+        <w:rPr>
+          <w:b/>
+          <w:bCs/>
+        </w:rPr>
+        <w:t xml:space="preserve">dos cuentas</w:t>
       </w:r>
       <w:r>
         <w:t xml:space="preserve">.</w:t>
@@ -1902,34 +1981,27 @@
         <w:t xml:space="preserve"> "</w:t>
       </w:r>
       <w:r>
-        <w:rPr>
-          <w:b/>
-          <w:bCs/>
-        </w:rPr>
-        <w:t xml:space="preserve">Primero, la población que viene</w:t>
-      </w:r>
-      <w:r>
-        <w:t xml:space="preserve">: viviendas previstas por habitantes por vivienda. Ese factor sale de un modelo sencillo, calibrado con </w:t>
-      </w:r>
-      <w:r>
-        <w:rPr>
-          <w:b/>
-          <w:bCs/>
-        </w:rPr>
-        <w:t xml:space="preserve">28 barrios ya habitados de 17 municipios</w:t>
-      </w:r>
-      <w:r>
-        <w:t xml:space="preserve">. ¿Acierta? Lo probamos con el pasado: dejamos fuera el municipio entero, predecimos su población sin mirar sus datos y la comparamos con el padrón real. </w:t>
-      </w:r>
-      <w:r>
-        <w:rPr>
-          <w:b/>
-          <w:bCs/>
-        </w:rPr>
-        <w:t xml:space="preserve">Error medio del 13 %; la regla habitual falla un 25 %.</w:t>
-      </w:r>
-      <w:r>
-        <w:t xml:space="preserve"> Y el rango que damos acierta el 79 % de las veces. Probamos más variables y ninguna mejoraba de forma fiable: preferimos un modelo que se pueda explicar.</w:t>
+        <w:t xml:space="preserve">La </w:t>
+      </w:r>
+      <w:r>
+        <w:rPr>
+          <w:b/>
+          <w:bCs/>
+        </w:rPr>
+        <w:t xml:space="preserve">primera</w:t>
+      </w:r>
+      <w:r>
+        <w:t xml:space="preserve">: ¿cuánta gente va a vivir en un barrio? Es el número de casas por las personas que viven en cada casa. Ese número sale de un modelo sencillo que hemos enseñado con </w:t>
+      </w:r>
+      <w:r>
+        <w:rPr>
+          <w:b/>
+          <w:bCs/>
+        </w:rPr>
+        <w:t xml:space="preserve">28 barrios</w:t>
+      </w:r>
+      <w:r>
+        <w:t xml:space="preserve"> que ya están habitados.</w:t>
       </w:r>
       <w:r>
         <w:t xml:space="preserve">"</w:t>
@@ -1947,39 +2019,110 @@
         <w:t xml:space="preserve"> "</w:t>
       </w:r>
       <w:r>
-        <w:rPr>
-          <w:b/>
-          <w:bCs/>
-        </w:rPr>
-        <w:t xml:space="preserve">Segundo, elegir la parcela.</w:t>
-      </w:r>
-      <w:r>
-        <w:t xml:space="preserve"> Candidatas: parcelas vacías de equipamiento. Elige la que cubre más demanda sin pasar de su capacidad, y repite. Y siempre enseña </w:t>
-      </w:r>
-      <w:r>
-        <w:rPr>
-          <w:b/>
-          <w:bCs/>
-        </w:rPr>
-        <w:t xml:space="preserve">tres alternativas descartadas</w:t>
-      </w:r>
-      <w:r>
-        <w:t xml:space="preserve"> y si la propuesta </w:t>
-      </w:r>
-      <w:r>
-        <w:rPr>
-          <w:b/>
-          <w:bCs/>
-        </w:rPr>
-        <w:t xml:space="preserve">aguanta</w:t>
-      </w:r>
-      <w:r>
-        <w:t xml:space="preserve"> con menos viviendas y tres años de retraso.</w:t>
+        <w:t xml:space="preserve">¿Y acierta? Le hicimos un </w:t>
+      </w:r>
+      <w:r>
+        <w:rPr>
+          <w:b/>
+          <w:bCs/>
+        </w:rPr>
+        <w:t xml:space="preserve">examen sorpresa</w:t>
+      </w:r>
+      <w:r>
+        <w:t xml:space="preserve">: tapamos un municipio entero, la web adivinó cuánta gente vivía allí, y lo comparamos con el dato real. Se equivoca de media un </w:t>
+      </w:r>
+      <w:r>
+        <w:rPr>
+          <w:b/>
+          <w:bCs/>
+        </w:rPr>
+        <w:t xml:space="preserve">13 %</w:t>
+      </w:r>
+      <w:r>
+        <w:t xml:space="preserve">. El método de siempre se equivoca un </w:t>
+      </w:r>
+      <w:r>
+        <w:rPr>
+          <w:b/>
+          <w:bCs/>
+        </w:rPr>
+        <w:t xml:space="preserve">25 %</w:t>
+      </w:r>
+      <w:r>
+        <w:t xml:space="preserve">: casi el doble. Y siempre damos un </w:t>
+      </w:r>
+      <w:r>
+        <w:rPr>
+          <w:b/>
+          <w:bCs/>
+        </w:rPr>
+        <w:t xml:space="preserve">rango</w:t>
+      </w:r>
+      <w:r>
+        <w:t xml:space="preserve">, un “entre tanto y tanto”, que acierta </w:t>
+      </w:r>
+      <w:r>
+        <w:rPr>
+          <w:b/>
+          <w:bCs/>
+        </w:rPr>
+        <w:t xml:space="preserve">8 de cada 10 veces</w:t>
+      </w:r>
+      <w:r>
+        <w:t xml:space="preserve">. Probamos a añadir más cosas y no mejoraba, así que lo dejamos sencillo para poder explicarlo.</w:t>
       </w:r>
       <w:r>
         <w:t xml:space="preserve">"</w:t>
       </w:r>
     </w:p>
+    <w:p>
+      <w:r>
+        <w:rPr>
+          <w:b/>
+          <w:bCs/>
+        </w:rPr>
+        <w:t xml:space="preserve">Claudia:</w:t>
+      </w:r>
+      <w:r>
+        <w:t xml:space="preserve"> "</w:t>
+      </w:r>
+      <w:r>
+        <w:t xml:space="preserve">La </w:t>
+      </w:r>
+      <w:r>
+        <w:rPr>
+          <w:b/>
+          <w:bCs/>
+        </w:rPr>
+        <w:t xml:space="preserve">segunda</w:t>
+      </w:r>
+      <w:r>
+        <w:t xml:space="preserve"> cuenta: ¿dónde ponemos el colegio? Buscamos terrenos vacíos que estén reservados para servicios. Elegimos el que le llega a más niños sin pasarse de sitio, y repetimos. Y siempre enseñamos </w:t>
+      </w:r>
+      <w:r>
+        <w:rPr>
+          <w:b/>
+          <w:bCs/>
+        </w:rPr>
+        <w:t xml:space="preserve">tres sitios que hemos descartado</w:t>
+      </w:r>
+      <w:r>
+        <w:t xml:space="preserve">, y si el plan </w:t>
+      </w:r>
+      <w:r>
+        <w:rPr>
+          <w:b/>
+          <w:bCs/>
+        </w:rPr>
+        <w:t xml:space="preserve">sigue valiendo</w:t>
+      </w:r>
+      <w:r>
+        <w:t xml:space="preserve"> aunque se hagan menos casas o se retrasen tres años.</w:t>
+      </w:r>
+      <w:r>
+        <w:t xml:space="preserve">"</w:t>
+      </w:r>
+    </w:p>
     <w:p/>
     <w:p>
       <w:pPr>
@@ -1993,7 +2136,7 @@
           <w:b/>
           <w:bCs/>
         </w:rPr>
-        <w:t xml:space="preserve">8:40 – 9:20 · Limitaciones y próximos pasos (diapositiva 5 · Lucía)</w:t>
+        <w:t xml:space="preserve">8:40 – 9:20 · Lo que falta y lo que viene (diapositiva 5 · Lucía)</w:t>
       </w:r>
     </w:p>
     <w:p>
@@ -2028,34 +2171,17 @@
         <w:t xml:space="preserve"> "</w:t>
       </w:r>
       <w:r>
-        <w:rPr>
-          <w:b/>
-          <w:bCs/>
-        </w:rPr>
-        <w:t xml:space="preserve">Sabemos dónde acaba lo que sabemos.</w:t>
-      </w:r>
-      <w:r>
-        <w:t xml:space="preserve"> Distancias en línea recta, a 80 metros por minuto, no por calles. Suelo público deducido del planeamiento: </w:t>
-      </w:r>
-      <w:r>
-        <w:rPr>
-          <w:i/>
-          <w:iCs/>
-        </w:rPr>
-        <w:t xml:space="preserve">titularidad por confirmar</w:t>
-      </w:r>
-      <w:r>
-        <w:t xml:space="preserve">. Tasas sin fuente: </w:t>
-      </w:r>
-      <w:r>
-        <w:rPr>
-          <w:i/>
-          <w:iCs/>
-        </w:rPr>
-        <w:t xml:space="preserve">por verificar</w:t>
-      </w:r>
-      <w:r>
-        <w:t xml:space="preserve">. Y el acceso de técnicos es de demostración.</w:t>
+        <w:t xml:space="preserve">Os decimos también lo que </w:t>
+      </w:r>
+      <w:r>
+        <w:rPr>
+          <w:b/>
+          <w:bCs/>
+        </w:rPr>
+        <w:t xml:space="preserve">todavía no hacemos bien</w:t>
+      </w:r>
+      <w:r>
+        <w:t xml:space="preserve">. Medimos las distancias en línea recta, como si volaras, y no por las calles. Los terrenos públicos los deducimos del plan urbanístico, y los marcamos como “por confirmar”. Y el acceso de técnicos es de prueba.</w:t>
       </w:r>
       <w:r>
         <w:t xml:space="preserve">"</w:t>
@@ -2073,37 +2199,45 @@
         <w:t xml:space="preserve"> "</w:t>
       </w:r>
       <w:r>
-        <w:t xml:space="preserve">Lo siguiente: </w:t>
-      </w:r>
-      <w:r>
-        <w:rPr>
-          <w:b/>
-          <w:bCs/>
-        </w:rPr>
-        <w:t xml:space="preserve">licitaciones y obras</w:t>
-      </w:r>
-      <w:r>
-        <w:t xml:space="preserve">, para saber qué colegios ya se están construyendo; </w:t>
-      </w:r>
-      <w:r>
-        <w:rPr>
-          <w:b/>
-          <w:bCs/>
-        </w:rPr>
-        <w:t xml:space="preserve">tiempos por calles</w:t>
-      </w:r>
-      <w:r>
-        <w:t xml:space="preserve">; validar con ayuntamientos; y un acceso real con Cl@ve. Y hoy ya funciona: está </w:t>
-      </w:r>
-      <w:r>
-        <w:rPr>
-          <w:b/>
-          <w:bCs/>
-        </w:rPr>
-        <w:t xml:space="preserve">publicado en Oracle Cloud</w:t>
-      </w:r>
-      <w:r>
-        <w:t xml:space="preserve">, vale para cualquier municipio y con un comando se actualiza con los datos nuevos. Cuesta cero: datos abiertos y software libre.</w:t>
+        <w:t xml:space="preserve">Lo siguiente: saber qué colegios </w:t>
+      </w:r>
+      <w:r>
+        <w:rPr>
+          <w:b/>
+          <w:bCs/>
+        </w:rPr>
+        <w:t xml:space="preserve">ya se están construyendo</w:t>
+      </w:r>
+      <w:r>
+        <w:t xml:space="preserve">, medir andando por las calles, y probarlo con los ayuntamientos.</w:t>
+      </w:r>
+      <w:r>
+        <w:t xml:space="preserve">"</w:t>
+      </w:r>
+    </w:p>
+    <w:p>
+      <w:r>
+        <w:rPr>
+          <w:b/>
+          <w:bCs/>
+        </w:rPr>
+        <w:t xml:space="preserve">Lucía:</w:t>
+      </w:r>
+      <w:r>
+        <w:t xml:space="preserve"> "</w:t>
+      </w:r>
+      <w:r>
+        <w:t xml:space="preserve">Y lo mejor: </w:t>
+      </w:r>
+      <w:r>
+        <w:rPr>
+          <w:b/>
+          <w:bCs/>
+        </w:rPr>
+        <w:t xml:space="preserve">ya funciona hoy</w:t>
+      </w:r>
+      <w:r>
+        <w:t xml:space="preserve">. Está publicado en internet, vale para cualquier municipio, y con un solo comando se actualiza con datos nuevos. No cuesta nada: datos abiertos y software libre.</w:t>
       </w:r>
       <w:r>
         <w:t xml:space="preserve">"</w:t>

</xml_diff>